<commit_message>
Regenerate all draft LOIs with Authority to Execute clause + add Merrimack; log Davidson exposure memo
Co-Authored-By: Claude Opus 4.8 <noreply@anthropic.com>
Claude-Session: https://claude.ai/code/session_019ajJRqKa1DUy4iKHJKPEi3
</commit_message>
<xml_diff>
--- a/cinderella/Outputs/LOIs/CINDERELLA CORP - Ball State University LOI (DRAFT).docx
+++ b/cinderella/Outputs/LOIs/CINDERELLA CORP - Ball State University LOI (DRAFT).docx
@@ -50,7 +50,6 @@
           <w:bCs w:val="false"/>
           <w:i w:val="false"/>
           <w:iCs w:val="false"/>
-          <w:caps w:val="false"/>
           <w:sz w:val="22"/>
           <w:szCs w:val="22"/>
         </w:rPr>
@@ -68,7 +67,6 @@
           <w:bCs w:val="false"/>
           <w:i w:val="false"/>
           <w:iCs w:val="false"/>
-          <w:caps w:val="false"/>
           <w:sz w:val="22"/>
           <w:szCs w:val="22"/>
         </w:rPr>
@@ -86,7 +84,6 @@
           <w:bCs w:val="false"/>
           <w:i w:val="false"/>
           <w:iCs w:val="false"/>
-          <w:caps w:val="false"/>
           <w:sz w:val="22"/>
           <w:szCs w:val="22"/>
         </w:rPr>
@@ -104,7 +101,6 @@
           <w:bCs w:val="false"/>
           <w:i w:val="false"/>
           <w:iCs w:val="false"/>
-          <w:caps w:val="false"/>
           <w:sz w:val="22"/>
           <w:szCs w:val="22"/>
         </w:rPr>
@@ -122,7 +118,6 @@
           <w:bCs w:val="false"/>
           <w:i w:val="false"/>
           <w:iCs w:val="false"/>
-          <w:caps w:val="false"/>
           <w:sz w:val="22"/>
           <w:szCs w:val="22"/>
         </w:rPr>
@@ -140,7 +135,6 @@
           <w:bCs/>
           <w:i w:val="false"/>
           <w:iCs w:val="false"/>
-          <w:caps w:val="false"/>
           <w:sz w:val="22"/>
           <w:szCs w:val="22"/>
         </w:rPr>
@@ -158,7 +152,6 @@
           <w:bCs w:val="false"/>
           <w:i w:val="false"/>
           <w:iCs w:val="false"/>
-          <w:caps w:val="false"/>
           <w:sz w:val="22"/>
           <w:szCs w:val="22"/>
         </w:rPr>
@@ -176,7 +169,6 @@
           <w:bCs/>
           <w:i w:val="false"/>
           <w:iCs w:val="false"/>
-          <w:caps w:val="false"/>
           <w:sz w:val="22"/>
           <w:szCs w:val="22"/>
         </w:rPr>
@@ -189,7 +181,6 @@
           <w:bCs w:val="false"/>
           <w:i w:val="false"/>
           <w:iCs w:val="false"/>
-          <w:caps w:val="false"/>
           <w:sz w:val="22"/>
           <w:szCs w:val="22"/>
         </w:rPr>
@@ -207,7 +198,6 @@
           <w:bCs w:val="false"/>
           <w:i w:val="false"/>
           <w:iCs w:val="false"/>
-          <w:caps w:val="false"/>
           <w:sz w:val="22"/>
           <w:szCs w:val="22"/>
         </w:rPr>
@@ -225,7 +215,6 @@
           <w:bCs w:val="false"/>
           <w:i w:val="false"/>
           <w:iCs w:val="false"/>
-          <w:caps w:val="false"/>
           <w:sz w:val="22"/>
           <w:szCs w:val="22"/>
         </w:rPr>
@@ -243,7 +232,6 @@
           <w:bCs w:val="false"/>
           <w:i/>
           <w:iCs/>
-          <w:caps w:val="false"/>
           <w:sz w:val="22"/>
           <w:szCs w:val="22"/>
         </w:rPr>
@@ -261,7 +249,6 @@
           <w:bCs/>
           <w:i w:val="false"/>
           <w:iCs w:val="false"/>
-          <w:caps w:val="false"/>
           <w:sz w:val="22"/>
           <w:szCs w:val="22"/>
         </w:rPr>
@@ -279,7 +266,6 @@
           <w:bCs w:val="false"/>
           <w:i w:val="false"/>
           <w:iCs w:val="false"/>
-          <w:caps w:val="false"/>
           <w:sz w:val="22"/>
           <w:szCs w:val="22"/>
         </w:rPr>
@@ -297,7 +283,6 @@
           <w:bCs w:val="false"/>
           <w:i w:val="false"/>
           <w:iCs w:val="false"/>
-          <w:caps w:val="false"/>
           <w:sz w:val="22"/>
           <w:szCs w:val="22"/>
         </w:rPr>
@@ -315,7 +300,6 @@
           <w:bCs/>
           <w:i w:val="false"/>
           <w:iCs w:val="false"/>
-          <w:caps w:val="false"/>
           <w:sz w:val="22"/>
           <w:szCs w:val="22"/>
         </w:rPr>
@@ -333,7 +317,6 @@
           <w:bCs w:val="false"/>
           <w:i w:val="false"/>
           <w:iCs w:val="false"/>
-          <w:caps w:val="false"/>
           <w:sz w:val="22"/>
           <w:szCs w:val="22"/>
         </w:rPr>
@@ -351,7 +334,6 @@
           <w:bCs w:val="false"/>
           <w:i w:val="false"/>
           <w:iCs w:val="false"/>
-          <w:caps w:val="false"/>
           <w:sz w:val="22"/>
           <w:szCs w:val="22"/>
         </w:rPr>
@@ -369,7 +351,6 @@
           <w:bCs w:val="false"/>
           <w:i w:val="false"/>
           <w:iCs w:val="false"/>
-          <w:caps w:val="false"/>
           <w:sz w:val="22"/>
           <w:szCs w:val="22"/>
         </w:rPr>
@@ -387,7 +368,6 @@
           <w:bCs/>
           <w:i w:val="false"/>
           <w:iCs w:val="false"/>
-          <w:caps w:val="false"/>
           <w:sz w:val="22"/>
           <w:szCs w:val="22"/>
         </w:rPr>
@@ -405,7 +385,6 @@
           <w:bCs w:val="false"/>
           <w:i w:val="false"/>
           <w:iCs w:val="false"/>
-          <w:caps w:val="false"/>
           <w:sz w:val="22"/>
           <w:szCs w:val="22"/>
         </w:rPr>
@@ -423,7 +402,6 @@
           <w:bCs w:val="false"/>
           <w:i w:val="false"/>
           <w:iCs w:val="false"/>
-          <w:caps w:val="false"/>
           <w:sz w:val="22"/>
           <w:szCs w:val="22"/>
         </w:rPr>
@@ -441,7 +419,6 @@
           <w:bCs w:val="false"/>
           <w:i w:val="false"/>
           <w:iCs w:val="false"/>
-          <w:caps w:val="false"/>
           <w:sz w:val="22"/>
           <w:szCs w:val="22"/>
         </w:rPr>
@@ -459,7 +436,6 @@
           <w:bCs w:val="false"/>
           <w:i w:val="false"/>
           <w:iCs w:val="false"/>
-          <w:caps w:val="false"/>
           <w:sz w:val="22"/>
           <w:szCs w:val="22"/>
         </w:rPr>
@@ -477,7 +453,6 @@
           <w:bCs w:val="false"/>
           <w:i w:val="false"/>
           <w:iCs w:val="false"/>
-          <w:caps w:val="false"/>
           <w:sz w:val="22"/>
           <w:szCs w:val="22"/>
         </w:rPr>
@@ -495,7 +470,6 @@
           <w:bCs w:val="false"/>
           <w:i w:val="false"/>
           <w:iCs w:val="false"/>
-          <w:caps w:val="false"/>
           <w:sz w:val="22"/>
           <w:szCs w:val="22"/>
         </w:rPr>
@@ -513,7 +487,6 @@
           <w:bCs/>
           <w:i w:val="false"/>
           <w:iCs w:val="false"/>
-          <w:caps w:val="false"/>
           <w:sz w:val="22"/>
           <w:szCs w:val="22"/>
         </w:rPr>
@@ -531,7 +504,6 @@
           <w:bCs w:val="false"/>
           <w:i w:val="false"/>
           <w:iCs w:val="false"/>
-          <w:caps w:val="false"/>
           <w:sz w:val="22"/>
           <w:szCs w:val="22"/>
         </w:rPr>
@@ -549,7 +521,6 @@
           <w:bCs/>
           <w:i w:val="false"/>
           <w:iCs w:val="false"/>
-          <w:caps w:val="false"/>
           <w:sz w:val="22"/>
           <w:szCs w:val="22"/>
         </w:rPr>
@@ -567,7 +538,6 @@
           <w:bCs w:val="false"/>
           <w:i w:val="false"/>
           <w:iCs w:val="false"/>
-          <w:caps w:val="false"/>
           <w:sz w:val="22"/>
           <w:szCs w:val="22"/>
         </w:rPr>
@@ -585,7 +555,6 @@
           <w:bCs/>
           <w:i w:val="false"/>
           <w:iCs w:val="false"/>
-          <w:caps w:val="false"/>
           <w:sz w:val="22"/>
           <w:szCs w:val="22"/>
         </w:rPr>
@@ -603,7 +572,6 @@
           <w:bCs w:val="false"/>
           <w:i w:val="false"/>
           <w:iCs w:val="false"/>
-          <w:caps w:val="false"/>
           <w:sz w:val="22"/>
           <w:szCs w:val="22"/>
         </w:rPr>
@@ -621,7 +589,6 @@
           <w:bCs w:val="false"/>
           <w:i w:val="false"/>
           <w:iCs w:val="false"/>
-          <w:caps w:val="false"/>
           <w:sz w:val="22"/>
           <w:szCs w:val="22"/>
         </w:rPr>
@@ -639,7 +606,6 @@
           <w:bCs/>
           <w:i w:val="false"/>
           <w:iCs w:val="false"/>
-          <w:caps w:val="false"/>
           <w:sz w:val="22"/>
           <w:szCs w:val="22"/>
         </w:rPr>
@@ -657,7 +623,6 @@
           <w:bCs w:val="false"/>
           <w:i w:val="false"/>
           <w:iCs w:val="false"/>
-          <w:caps w:val="false"/>
           <w:sz w:val="22"/>
           <w:szCs w:val="22"/>
         </w:rPr>
@@ -675,7 +640,6 @@
           <w:bCs/>
           <w:i w:val="false"/>
           <w:iCs w:val="false"/>
-          <w:caps w:val="false"/>
           <w:sz w:val="22"/>
           <w:szCs w:val="22"/>
         </w:rPr>
@@ -693,7 +657,6 @@
           <w:bCs w:val="false"/>
           <w:i w:val="false"/>
           <w:iCs w:val="false"/>
-          <w:caps w:val="false"/>
           <w:sz w:val="22"/>
           <w:szCs w:val="22"/>
         </w:rPr>
@@ -711,7 +674,6 @@
           <w:bCs/>
           <w:i w:val="false"/>
           <w:iCs w:val="false"/>
-          <w:caps w:val="false"/>
           <w:sz w:val="22"/>
           <w:szCs w:val="22"/>
         </w:rPr>
@@ -729,7 +691,6 @@
           <w:bCs w:val="false"/>
           <w:i w:val="false"/>
           <w:iCs w:val="false"/>
-          <w:caps w:val="false"/>
           <w:sz w:val="22"/>
           <w:szCs w:val="22"/>
         </w:rPr>
@@ -747,7 +708,6 @@
           <w:bCs/>
           <w:i w:val="false"/>
           <w:iCs w:val="false"/>
-          <w:caps w:val="false"/>
           <w:sz w:val="22"/>
           <w:szCs w:val="22"/>
         </w:rPr>
@@ -765,11 +725,10 @@
           <w:bCs w:val="false"/>
           <w:i w:val="false"/>
           <w:iCs w:val="false"/>
-          <w:caps w:val="false"/>
-          <w:sz w:val="22"/>
-          <w:szCs w:val="22"/>
-        </w:rPr>
-        <w:t xml:space="preserve">During the period that Ball State is actively engaged with the Company in negotiating or executing a definitive cooperation agreement (the "Exclusivity Period"), the school agrees not to enter into any similar arrangement with a competing documentary franchise or production entity focused on the transformation of college basketball programs through private investment. The Exclusivity Period shall not exceed 12 months from the date of this letter, unless extended by mutual written agreement. This exclusivity provision is the sole binding provision of this letter, apart from confidentiality.</w:t>
+          <w:sz w:val="22"/>
+          <w:szCs w:val="22"/>
+        </w:rPr>
+        <w:t xml:space="preserve">During the period that Ball State is actively engaged with the Company in negotiating or executing a definitive cooperation agreement (the "Exclusivity Period"), the school agrees not to enter into any similar arrangement with a competing documentary franchise or production entity focused on the transformation of college basketball programs through private investment. The Exclusivity Period shall not exceed 12 months from the date of this letter, unless extended by mutual written agreement. Together with the confidentiality provision (Section 11) and the authority representation (Section 13), this exclusivity provision is binding; the remainder of this letter is non-binding.</w:t>
       </w:r>
     </w:p>
     <w:p>
@@ -783,7 +742,6 @@
           <w:bCs/>
           <w:i w:val="false"/>
           <w:iCs w:val="false"/>
-          <w:caps w:val="false"/>
           <w:sz w:val="22"/>
           <w:szCs w:val="22"/>
         </w:rPr>
@@ -801,7 +759,6 @@
           <w:bCs w:val="false"/>
           <w:i w:val="false"/>
           <w:iCs w:val="false"/>
-          <w:caps w:val="false"/>
           <w:sz w:val="22"/>
           <w:szCs w:val="22"/>
         </w:rPr>
@@ -819,7 +776,6 @@
           <w:bCs/>
           <w:i w:val="false"/>
           <w:iCs w:val="false"/>
-          <w:caps w:val="false"/>
           <w:sz w:val="22"/>
           <w:szCs w:val="22"/>
         </w:rPr>
@@ -837,7 +793,6 @@
           <w:bCs w:val="false"/>
           <w:i w:val="false"/>
           <w:iCs w:val="false"/>
-          <w:caps w:val="false"/>
           <w:sz w:val="22"/>
           <w:szCs w:val="22"/>
         </w:rPr>
@@ -855,43 +810,74 @@
           <w:bCs/>
           <w:i w:val="false"/>
           <w:iCs w:val="false"/>
-          <w:caps w:val="false"/>
-          <w:sz w:val="22"/>
-          <w:szCs w:val="22"/>
-        </w:rPr>
-        <w:t xml:space="preserve">13. Governing Law</w:t>
-      </w:r>
-    </w:p>
-    <w:p>
-      <w:pPr>
-        <w:spacing w:after="140" w:before="0" w:line="276"/>
-      </w:pPr>
-      <w:r>
-        <w:rPr>
-          <w:rFonts w:ascii="Garamond" w:cs="Garamond" w:eastAsia="Garamond" w:hAnsi="Garamond"/>
-          <w:b w:val="false"/>
-          <w:bCs w:val="false"/>
-          <w:i w:val="false"/>
-          <w:iCs w:val="false"/>
-          <w:caps w:val="false"/>
-          <w:sz w:val="22"/>
-          <w:szCs w:val="22"/>
-        </w:rPr>
-        <w:t xml:space="preserve">This letter shall be governed by the laws of the State of Indiana. The binding provisions (Sections 10 and 11) shall survive regardless of whether a definitive agreement is reached.</w:t>
-      </w:r>
-    </w:p>
-    <w:p>
-      <w:pPr>
-        <w:spacing w:after="140" w:before="0" w:line="276"/>
-      </w:pPr>
-      <w:r>
-        <w:rPr>
-          <w:rFonts w:ascii="Garamond" w:cs="Garamond" w:eastAsia="Garamond" w:hAnsi="Garamond"/>
-          <w:b w:val="false"/>
-          <w:bCs w:val="false"/>
-          <w:i w:val="false"/>
-          <w:iCs w:val="false"/>
-          <w:caps w:val="false"/>
+          <w:sz w:val="22"/>
+          <w:szCs w:val="22"/>
+        </w:rPr>
+        <w:t xml:space="preserve">13. Authority to Execute</w:t>
+      </w:r>
+    </w:p>
+    <w:p>
+      <w:pPr>
+        <w:spacing w:after="140" w:before="0" w:line="276"/>
+      </w:pPr>
+      <w:r>
+        <w:rPr>
+          <w:rFonts w:ascii="Garamond" w:cs="Garamond" w:eastAsia="Garamond" w:hAnsi="Garamond"/>
+          <w:b w:val="false"/>
+          <w:bCs w:val="false"/>
+          <w:i w:val="false"/>
+          <w:iCs w:val="false"/>
+          <w:sz w:val="22"/>
+          <w:szCs w:val="22"/>
+        </w:rPr>
+        <w:t xml:space="preserve">Each individual signing this letter on behalf of a party represents and warrants that he or she is duly authorized to execute this letter on behalf of, and to bind, that party with respect to the binding provisions of this letter, and that no further approval or authorization is required for that party to be bound by those provisions. This representation is binding.</w:t>
+      </w:r>
+    </w:p>
+    <w:p>
+      <w:pPr>
+        <w:spacing w:after="80" w:before="220" w:line="276"/>
+      </w:pPr>
+      <w:r>
+        <w:rPr>
+          <w:rFonts w:ascii="Garamond" w:cs="Garamond" w:eastAsia="Garamond" w:hAnsi="Garamond"/>
+          <w:b/>
+          <w:bCs/>
+          <w:i w:val="false"/>
+          <w:iCs w:val="false"/>
+          <w:sz w:val="22"/>
+          <w:szCs w:val="22"/>
+        </w:rPr>
+        <w:t xml:space="preserve">14. Governing Law</w:t>
+      </w:r>
+    </w:p>
+    <w:p>
+      <w:pPr>
+        <w:spacing w:after="140" w:before="0" w:line="276"/>
+      </w:pPr>
+      <w:r>
+        <w:rPr>
+          <w:rFonts w:ascii="Garamond" w:cs="Garamond" w:eastAsia="Garamond" w:hAnsi="Garamond"/>
+          <w:b w:val="false"/>
+          <w:bCs w:val="false"/>
+          <w:i w:val="false"/>
+          <w:iCs w:val="false"/>
+          <w:sz w:val="22"/>
+          <w:szCs w:val="22"/>
+        </w:rPr>
+        <w:t xml:space="preserve">This letter shall be governed by the laws of the State of Indiana. The binding provisions (Sections 10, 11, and 13) shall survive regardless of whether a definitive agreement is reached.</w:t>
+      </w:r>
+    </w:p>
+    <w:p>
+      <w:pPr>
+        <w:spacing w:after="140" w:before="0" w:line="276"/>
+      </w:pPr>
+      <w:r>
+        <w:rPr>
+          <w:rFonts w:ascii="Garamond" w:cs="Garamond" w:eastAsia="Garamond" w:hAnsi="Garamond"/>
+          <w:b w:val="false"/>
+          <w:bCs w:val="false"/>
+          <w:i w:val="false"/>
+          <w:iCs w:val="false"/>
           <w:sz w:val="22"/>
           <w:szCs w:val="22"/>
         </w:rPr>
@@ -909,7 +895,6 @@
           <w:bCs w:val="false"/>
           <w:i w:val="false"/>
           <w:iCs w:val="false"/>
-          <w:caps w:val="false"/>
           <w:sz w:val="22"/>
           <w:szCs w:val="22"/>
         </w:rPr>
@@ -927,7 +912,6 @@
           <w:bCs w:val="false"/>
           <w:i w:val="false"/>
           <w:iCs w:val="false"/>
-          <w:caps w:val="false"/>
           <w:sz w:val="22"/>
           <w:szCs w:val="22"/>
         </w:rPr>
@@ -945,7 +929,6 @@
           <w:bCs/>
           <w:i w:val="false"/>
           <w:iCs w:val="false"/>
-          <w:caps w:val="false"/>
           <w:sz w:val="22"/>
           <w:szCs w:val="22"/>
         </w:rPr>
@@ -963,7 +946,6 @@
           <w:bCs w:val="false"/>
           <w:i w:val="false"/>
           <w:iCs w:val="false"/>
-          <w:caps w:val="false"/>
           <w:sz w:val="22"/>
           <w:szCs w:val="22"/>
         </w:rPr>
@@ -981,7 +963,6 @@
           <w:bCs w:val="false"/>
           <w:i w:val="false"/>
           <w:iCs w:val="false"/>
-          <w:caps w:val="false"/>
           <w:sz w:val="22"/>
           <w:szCs w:val="22"/>
         </w:rPr>
@@ -999,7 +980,6 @@
           <w:bCs w:val="false"/>
           <w:i w:val="false"/>
           <w:iCs w:val="false"/>
-          <w:caps w:val="false"/>
           <w:sz w:val="22"/>
           <w:szCs w:val="22"/>
         </w:rPr>
@@ -1017,7 +997,6 @@
           <w:bCs/>
           <w:i w:val="false"/>
           <w:iCs w:val="false"/>
-          <w:caps w:val="false"/>
           <w:sz w:val="22"/>
           <w:szCs w:val="22"/>
         </w:rPr>
@@ -1035,7 +1014,6 @@
           <w:bCs w:val="false"/>
           <w:i w:val="false"/>
           <w:iCs w:val="false"/>
-          <w:caps w:val="false"/>
           <w:sz w:val="22"/>
           <w:szCs w:val="22"/>
         </w:rPr>
@@ -1053,7 +1031,6 @@
           <w:bCs w:val="false"/>
           <w:i w:val="false"/>
           <w:iCs w:val="false"/>
-          <w:caps w:val="false"/>
           <w:sz w:val="22"/>
           <w:szCs w:val="22"/>
         </w:rPr>
@@ -1071,7 +1048,6 @@
           <w:bCs w:val="false"/>
           <w:i w:val="false"/>
           <w:iCs w:val="false"/>
-          <w:caps w:val="false"/>
           <w:sz w:val="22"/>
           <w:szCs w:val="22"/>
         </w:rPr>

</xml_diff>